<commit_message>
feat: update markdown2docx skill workflow
Refresh the skill guidance and conversion pipeline so thesis-style Markdown handles explicit table captions, inline formatting, formulas, and bibliography output more reliably.

Co-Authored-By: Claude Opus 4.6 <noreply@anthropic.com>
</commit_message>
<xml_diff>
--- a/examples/xref_test.docx
+++ b/examples/xref_test.docx
@@ -20,12 +20,13 @@
       </w:r>
     </w:p>
     <w:p>
-      <w:pPr>
-        <w:spacing w:lineRule="auto" w:line="360" w:before="0" w:after="0"/>
-        <w:ind w:firstLine="480"/>
-        <w:jc w:val="both"/>
-      </w:pPr>
       <w:r>
+        <w:rPr>
+          <w:rFonts w:ascii="Times New Roman" w:hAnsi="Times New Roman" w:eastAsia="宋体"/>
+          <w:b w:val="0"/>
+          <w:i w:val="0"/>
+          <w:sz w:val="24"/>
+        </w:rPr>
         <w:t>本章介绍基本理论。如</w:t>
       </w:r>
       <w:r>
@@ -38,12 +39,21 @@
         <w:fldChar w:fldCharType="separate"/>
       </w:r>
       <w:r>
+        <w:rPr>
+          <w:rFonts w:ascii="Times New Roman" w:hAnsi="Times New Roman" w:eastAsia="宋体"/>
+        </w:rPr>
         <w:t>图 1-1</w:t>
       </w:r>
       <w:r>
         <w:fldChar w:fldCharType="end"/>
       </w:r>
       <w:r>
+        <w:rPr>
+          <w:rFonts w:ascii="Times New Roman" w:hAnsi="Times New Roman" w:eastAsia="宋体"/>
+          <w:b w:val="0"/>
+          <w:i w:val="0"/>
+          <w:sz w:val="24"/>
+        </w:rPr>
         <w:t>所示，系统架构分为三层。</w:t>
       </w:r>
     </w:p>
@@ -188,12 +198,13 @@
       <w:bookmarkEnd w:id="5"/>
     </w:p>
     <w:p>
-      <w:pPr>
-        <w:spacing w:lineRule="auto" w:line="360" w:before="0" w:after="0"/>
-        <w:ind w:firstLine="480"/>
-        <w:jc w:val="both"/>
-      </w:pPr>
       <w:r>
+        <w:rPr>
+          <w:rFonts w:ascii="Times New Roman" w:hAnsi="Times New Roman" w:eastAsia="宋体"/>
+          <w:b w:val="0"/>
+          <w:i w:val="0"/>
+          <w:sz w:val="24"/>
+        </w:rPr>
         <w:t>由公式</w:t>
       </w:r>
       <w:r>
@@ -206,12 +217,21 @@
         <w:fldChar w:fldCharType="separate"/>
       </w:r>
       <w:r>
+        <w:rPr>
+          <w:rFonts w:ascii="Times New Roman" w:hAnsi="Times New Roman" w:eastAsia="宋体"/>
+        </w:rPr>
         <w:t>(1-1)</w:t>
       </w:r>
       <w:r>
         <w:fldChar w:fldCharType="end"/>
       </w:r>
       <w:r>
+        <w:rPr>
+          <w:rFonts w:ascii="Times New Roman" w:hAnsi="Times New Roman" w:eastAsia="宋体"/>
+          <w:b w:val="0"/>
+          <w:i w:val="0"/>
+          <w:sz w:val="24"/>
+        </w:rPr>
         <w:t>可得，能量与质量成正比。</w:t>
       </w:r>
     </w:p>
@@ -233,12 +253,13 @@
       </w:r>
     </w:p>
     <w:p>
-      <w:pPr>
-        <w:spacing w:lineRule="auto" w:line="360" w:before="0" w:after="0"/>
-        <w:ind w:firstLine="480"/>
-        <w:jc w:val="both"/>
-      </w:pPr>
       <w:r>
+        <w:rPr>
+          <w:rFonts w:ascii="Times New Roman" w:hAnsi="Times New Roman" w:eastAsia="宋体"/>
+          <w:b w:val="0"/>
+          <w:i w:val="0"/>
+          <w:sz w:val="24"/>
+        </w:rPr>
         <w:t>实验结果见</w:t>
       </w:r>
       <w:r>
@@ -251,12 +272,21 @@
         <w:fldChar w:fldCharType="separate"/>
       </w:r>
       <w:r>
+        <w:rPr>
+          <w:rFonts w:ascii="Times New Roman" w:hAnsi="Times New Roman" w:eastAsia="宋体"/>
+        </w:rPr>
         <w:t>图 2-1</w:t>
       </w:r>
       <w:r>
         <w:fldChar w:fldCharType="end"/>
       </w:r>
       <w:r>
+        <w:rPr>
+          <w:rFonts w:ascii="Times New Roman" w:hAnsi="Times New Roman" w:eastAsia="宋体"/>
+          <w:b w:val="0"/>
+          <w:i w:val="0"/>
+          <w:sz w:val="24"/>
+        </w:rPr>
         <w:t>。</w:t>
       </w:r>
     </w:p>
@@ -447,12 +477,13 @@
       <w:bookmarkEnd w:id="6"/>
     </w:p>
     <w:p>
-      <w:pPr>
-        <w:spacing w:lineRule="auto" w:line="360" w:before="0" w:after="0"/>
-        <w:ind w:firstLine="480"/>
-        <w:jc w:val="both"/>
-      </w:pPr>
       <w:r>
+        <w:rPr>
+          <w:rFonts w:ascii="Times New Roman" w:hAnsi="Times New Roman" w:eastAsia="宋体"/>
+          <w:b w:val="0"/>
+          <w:i w:val="0"/>
+          <w:sz w:val="24"/>
+        </w:rPr>
         <w:t>根据研究</w:t>
       </w:r>
       <w:r>
@@ -466,6 +497,7 @@
       </w:r>
       <w:r>
         <w:rPr>
+          <w:rFonts w:ascii="Times New Roman" w:hAnsi="Times New Roman" w:eastAsia="宋体"/>
           <w:vertAlign w:val="superscript"/>
         </w:rPr>
         <w:t>[1]</w:t>
@@ -474,6 +506,12 @@
         <w:fldChar w:fldCharType="end"/>
       </w:r>
       <w:r>
+        <w:rPr>
+          <w:rFonts w:ascii="Times New Roman" w:hAnsi="Times New Roman" w:eastAsia="宋体"/>
+          <w:b w:val="0"/>
+          <w:i w:val="0"/>
+          <w:sz w:val="24"/>
+        </w:rPr>
         <w:t>和</w:t>
       </w:r>
       <w:r>
@@ -487,6 +525,7 @@
       </w:r>
       <w:r>
         <w:rPr>
+          <w:rFonts w:ascii="Times New Roman" w:hAnsi="Times New Roman" w:eastAsia="宋体"/>
           <w:vertAlign w:val="superscript"/>
         </w:rPr>
         <w:t>[2]</w:t>
@@ -495,6 +534,12 @@
         <w:fldChar w:fldCharType="end"/>
       </w:r>
       <w:r>
+        <w:rPr>
+          <w:rFonts w:ascii="Times New Roman" w:hAnsi="Times New Roman" w:eastAsia="宋体"/>
+          <w:b w:val="0"/>
+          <w:i w:val="0"/>
+          <w:sz w:val="24"/>
+        </w:rPr>
         <w:t>，实验数据与理论吻合。</w:t>
       </w:r>
     </w:p>
@@ -526,7 +571,34 @@
           <w:i w:val="0"/>
           <w:sz w:val="21"/>
         </w:rPr>
-        <w:t xml:space="preserve">[1] </w:t>
+        <w:t>[</w:t>
+      </w:r>
+      <w:r>
+        <w:fldChar w:fldCharType="begin"/>
+      </w:r>
+      <w:r>
+        <w:instrText xml:space="preserve"> SEQ ref \* ARABIC </w:instrText>
+      </w:r>
+      <w:r>
+        <w:fldChar w:fldCharType="separate"/>
+      </w:r>
+      <w:r>
+        <w:rPr>
+          <w:rFonts w:ascii="Times New Roman" w:hAnsi="Times New Roman" w:eastAsia="宋体"/>
+        </w:rPr>
+        <w:t>1</w:t>
+      </w:r>
+      <w:r>
+        <w:fldChar w:fldCharType="end"/>
+      </w:r>
+      <w:r>
+        <w:rPr>
+          <w:rFonts w:ascii="Times New Roman" w:hAnsi="Times New Roman" w:eastAsia="宋体"/>
+          <w:b w:val="0"/>
+          <w:i w:val="0"/>
+          <w:sz w:val="21"/>
+        </w:rPr>
+        <w:t xml:space="preserve">] </w:t>
       </w:r>
       <w:bookmarkEnd w:id="1"/>
       <w:r>
@@ -552,7 +624,34 @@
           <w:i w:val="0"/>
           <w:sz w:val="21"/>
         </w:rPr>
-        <w:t xml:space="preserve">[2] </w:t>
+        <w:t>[</w:t>
+      </w:r>
+      <w:r>
+        <w:fldChar w:fldCharType="begin"/>
+      </w:r>
+      <w:r>
+        <w:instrText xml:space="preserve"> SEQ ref \* ARABIC </w:instrText>
+      </w:r>
+      <w:r>
+        <w:fldChar w:fldCharType="separate"/>
+      </w:r>
+      <w:r>
+        <w:rPr>
+          <w:rFonts w:ascii="Times New Roman" w:hAnsi="Times New Roman" w:eastAsia="宋体"/>
+        </w:rPr>
+        <w:t>2</w:t>
+      </w:r>
+      <w:r>
+        <w:fldChar w:fldCharType="end"/>
+      </w:r>
+      <w:r>
+        <w:rPr>
+          <w:rFonts w:ascii="Times New Roman" w:hAnsi="Times New Roman" w:eastAsia="宋体"/>
+          <w:b w:val="0"/>
+          <w:i w:val="0"/>
+          <w:sz w:val="21"/>
+        </w:rPr>
+        <w:t xml:space="preserve">] </w:t>
       </w:r>
       <w:bookmarkEnd w:id="2"/>
       <w:r>
@@ -991,6 +1090,9 @@
     <w:name w:val="Normal"/>
     <w:qFormat/>
     <w:rsid w:val="00FC693F"/>
+    <w:rPr>
+      <w:rFonts w:ascii="Times New Roman" w:hAnsi="Times New Roman" w:eastAsia="宋体"/>
+    </w:rPr>
   </w:style>
   <w:style w:type="paragraph" w:styleId="Header">
     <w:name w:val="header"/>

</xml_diff>